<commit_message>
test(fixture): use English text in split-ordered-list.docx
Easier to read in the upstream mammoth.js issue report.

Co-Authored-By: Claude Sonnet 4.6 <noreply@anthropic.com>
</commit_message>
<xml_diff>
--- a/tests/fixtures/split-ordered-list.docx
+++ b/tests/fixtures/split-ordered-list.docx
@@ -11,12 +11,12 @@
         </w:numPr>
       </w:pPr>
       <w:r>
-        <w:t>primo</w:t>
+        <w:t>first</w:t>
       </w:r>
     </w:p>
     <w:p>
       <w:r>
-        <w:t>tra i due</w:t>
+        <w:t>in between</w:t>
       </w:r>
     </w:p>
     <w:p>
@@ -28,7 +28,7 @@
         </w:numPr>
       </w:pPr>
       <w:r>
-        <w:t>secondo</w:t>
+        <w:t>second</w:t>
       </w:r>
     </w:p>
   </w:body>

</xml_diff>